<commit_message>
Template for ItSummer event was implemented
</commit_message>
<xml_diff>
--- a/templates/tpl_certificate_it_summer.docx
+++ b/templates/tpl_certificate_it_summer.docx
@@ -139,16 +139,8 @@
                                 <w:lang w:val="en-US"/>
                               </w:rPr>
                             </w:pPr>
-                            <w:r>
-                              <w:rPr>
-                                <w:rFonts w:ascii="Montserrat Light" w:hAnsi="Montserrat Light" w:cs="Cambria"/>
-                                <w:b/>
-                                <w:sz w:val="30"/>
-                                <w:szCs w:val="30"/>
-                                <w:lang w:val="en-US"/>
-                              </w:rPr>
-                              <w:t>«</w:t>
-                            </w:r>
+                            <w:bookmarkStart w:id="0" w:name="_GoBack"/>
+                            <w:bookmarkEnd w:id="0"/>
                             <w:r>
                               <w:rPr>
                                 <w:rFonts w:ascii="Montserrat Light" w:hAnsi="Montserrat Light" w:cs="Cambria"/>
@@ -307,16 +299,8 @@
                           <w:lang w:val="en-US"/>
                         </w:rPr>
                       </w:pPr>
-                      <w:r>
-                        <w:rPr>
-                          <w:rFonts w:ascii="Montserrat Light" w:hAnsi="Montserrat Light" w:cs="Cambria"/>
-                          <w:b/>
-                          <w:sz w:val="30"/>
-                          <w:szCs w:val="30"/>
-                          <w:lang w:val="en-US"/>
-                        </w:rPr>
-                        <w:t>«</w:t>
-                      </w:r>
+                      <w:bookmarkStart w:id="1" w:name="_GoBack"/>
+                      <w:bookmarkEnd w:id="1"/>
                       <w:r>
                         <w:rPr>
                           <w:rFonts w:ascii="Montserrat Light" w:hAnsi="Montserrat Light" w:cs="Cambria"/>
@@ -796,8 +780,6 @@
           </wp:inline>
         </w:drawing>
       </w:r>
-      <w:bookmarkStart w:id="0" w:name="_GoBack"/>
-      <w:bookmarkEnd w:id="0"/>
     </w:p>
     <w:sectPr>
       <w:pgSz w:w="16838" w:h="11906" w:orient="landscape"/>

</xml_diff>